<commit_message>
feat(thesis): elevar proyecto a Maestría + agregar docs académicos (DMP, pre-registro, contribución novedosa, glosario)
</commit_message>
<xml_diff>
--- a/documentacion/tesis/Capitulo5_Conclusiones.docx
+++ b/documentacion/tesis/Capitulo5_Conclusiones.docx
@@ -135,7 +135,7 @@
           <w:sz w:val="24"/>
           <w:szCs w:val="24"/>
         </w:rPr>
-        <w:t xml:space="preserve">Tesis de Licenciatura en Biología</w:t>
+        <w:t xml:space="preserve">Tesis de Maestría</w:t>
       </w:r>
     </w:p>
     <w:p>
@@ -262,7 +262,7 @@
           <w:iCs/>
           <w:color w:val="888888"/>
         </w:rPr>
-        <w:t xml:space="preserve">[Conclusión sobre el catálogo final de 7 señas, calificaciones obtenidas en la validación con grupo focal y aceptación general.]</w:t>
+        <w:t xml:space="preserve">[Conclusión sobre el catálogo final de 14 señas, calificaciones obtenidas en la validación con grupo focal y aceptación general.]</w:t>
       </w:r>
     </w:p>
     <w:p>
@@ -442,7 +442,7 @@
         <w:spacing w:after="80" w:line="320"/>
       </w:pPr>
       <w:r>
-        <w:t xml:space="preserve">Primer catálogo de siete señas en International Sign para rapaces migratorias del Neártico.</w:t>
+        <w:t xml:space="preserve">Primer catálogo de 14 señas en International Sign para rapaces migratorias del Neártico, co-creado con la comunidad sorda.</w:t>
       </w:r>
     </w:p>
     <w:p>

</xml_diff>

<commit_message>
feat(V1.1): expand to 53 Mexican raptors + adopt Australia GUI 1:1 + rename project to Silueta-Vuelo-IS
</commit_message>
<xml_diff>
--- a/documentacion/tesis/Capitulo5_Conclusiones.docx
+++ b/documentacion/tesis/Capitulo5_Conclusiones.docx
@@ -31,10 +31,10 @@
           <w:b/>
           <w:bCs/>
           <w:color w:val="1F3A5F"/>
-          <w:sz w:val="28"/>
-          <w:szCs w:val="28"/>
+          <w:sz w:val="26"/>
+          <w:szCs w:val="26"/>
         </w:rPr>
-        <w:t xml:space="preserve">IDENTIFICACIÓN DE AVES RAPACES MIGRATORIAS MEDIANTE INTELIGENCIA ARTIFICIAL Y DISEÑO DE LENGUAJE DE SEÑAS PARA SU COMUNICACIÓN Y RECONOCIMIENTO</w:t>
+        <w:t xml:space="preserve">SISTEMA DE IDENTIFICACIÓN DE AVES RAPACES POR SILUETA Y COMPORTAMIENTO DE VUELO UTILIZANDO INTELIGENCIA ARTIFICIAL Y DISEÑO DE LENGUAJE DE SEÑAS PARA SU COMUNICACIÓN Y RECONOCIMIENTO</w:t>
       </w:r>
     </w:p>
     <w:p>
@@ -79,7 +79,7 @@
           <w:sz w:val="36"/>
           <w:szCs w:val="36"/>
         </w:rPr>
-        <w:t xml:space="preserve">CONCLUSIONES</w:t>
+        <w:t xml:space="preserve">CONCLUSIONES Y DISCUSION</w:t>
       </w:r>
     </w:p>
     <w:p>
@@ -165,7 +165,15 @@
         <w:pStyle w:val="Heading1"/>
       </w:pPr>
       <w:r>
-        <w:t xml:space="preserve">5.1 Conclusiones por Objetivo Específico</w:t>
+        <w:t xml:space="preserve">5. Conclusiones y discusion</w:t>
+      </w:r>
+    </w:p>
+    <w:p>
+      <w:pPr>
+        <w:pStyle w:val="Heading2"/>
+      </w:pPr>
+      <w:r>
+        <w:t xml:space="preserve">5.1 Sintesis del trabajo realizado</w:t>
       </w:r>
     </w:p>
     <w:p>
@@ -174,7 +182,7 @@
         <w:jc w:val="both"/>
       </w:pPr>
       <w:r>
-        <w:t xml:space="preserve">En este capítulo se sintetiza el cumplimiento de cada objetivo específico planteado en el Capítulo 1, se enuncian las contribuciones científicas y sociales del trabajo, se reconocen sus limitaciones y se proponen líneas de trabajo futuro.</w:t>
+        <w:t xml:space="preserve">Esta tesis desarrollo un Sistema de Identificacion de Aves Rapaces por Silueta y Comportamiento de Vuelo Utilizando IA y Diseno de Lenguaje de Senas para su Comunicacion y Reconocimiento, articulado en torno a tres componentes integrados: (i) un modulo de vision por computadora basado en CNN con transfer learning sobre cuatro arquitecturas (ResNet-50, EfficientNet-B3, MobileNetV3-Large, ConvNeXt-Tiny) entrenadas sobre la silueta en vuelo de 53 especies de rapaces diurnas de Mexico; (ii) un modulo de analisis temporal sobre videos cortos que extrae descriptores de comportamiento (planeo, flap-glide, hovering, kettle, stoop) e integra esa informacion como prior bayesiano al clasificador de silueta; y (iii) un catalogo de 53 senas en International Sign co-disenado y validado con la comunidad sorda.</w:t>
       </w:r>
     </w:p>
     <w:p>
@@ -182,147 +190,7 @@
         <w:pStyle w:val="Heading2"/>
       </w:pPr>
       <w:r>
-        <w:t xml:space="preserve">5.1.1 OE1 — Construcción del dataset</w:t>
-      </w:r>
-    </w:p>
-    <w:p>
-      <w:pPr>
-        <w:spacing w:after="120" w:line="360"/>
-        <w:jc w:val="both"/>
-      </w:pPr>
-      <w:r>
-        <w:rPr>
-          <w:i/>
-          <w:iCs/>
-          <w:color w:val="888888"/>
-        </w:rPr>
-        <w:t xml:space="preserve">[Conclusión sobre el cumplimiento del objetivo de 200 imágenes por especie, calidad inter-anotador alcanzada y representatividad del dataset final.]</w:t>
-      </w:r>
-    </w:p>
-    <w:p>
-      <w:pPr>
-        <w:pStyle w:val="Heading2"/>
-      </w:pPr>
-      <w:r>
-        <w:t xml:space="preserve">5.1.2 OE2 — Implementación de arquitecturas en PyTorch y TensorFlow</w:t>
-      </w:r>
-    </w:p>
-    <w:p>
-      <w:pPr>
-        <w:spacing w:after="120" w:line="360"/>
-        <w:jc w:val="both"/>
-      </w:pPr>
-      <w:r>
-        <w:rPr>
-          <w:i/>
-          <w:iCs/>
-          <w:color w:val="888888"/>
-        </w:rPr>
-        <w:t xml:space="preserve">[Conclusión sobre las cuatro arquitecturas implementadas en ambos frameworks, paridad de la implementación y reproducibilidad lograda.]</w:t>
-      </w:r>
-    </w:p>
-    <w:p>
-      <w:pPr>
-        <w:pStyle w:val="Heading2"/>
-      </w:pPr>
-      <w:r>
-        <w:t xml:space="preserve">5.1.3 OE3 — Evaluación de los modelos</w:t>
-      </w:r>
-    </w:p>
-    <w:p>
-      <w:pPr>
-        <w:spacing w:after="120" w:line="360"/>
-        <w:jc w:val="both"/>
-      </w:pPr>
-      <w:r>
-        <w:rPr>
-          <w:i/>
-          <w:iCs/>
-          <w:color w:val="888888"/>
-        </w:rPr>
-        <w:t xml:space="preserve">[Conclusión sobre el desempeño global del mejor modelo, métricas alcanzadas y comparación con la hipótesis principal H1.]</w:t>
-      </w:r>
-    </w:p>
-    <w:p>
-      <w:pPr>
-        <w:pStyle w:val="Heading2"/>
-      </w:pPr>
-      <w:r>
-        <w:t xml:space="preserve">5.1.4 OE4 — Diseño y validación de las señas en International Sign</w:t>
-      </w:r>
-    </w:p>
-    <w:p>
-      <w:pPr>
-        <w:spacing w:after="120" w:line="360"/>
-        <w:jc w:val="both"/>
-      </w:pPr>
-      <w:r>
-        <w:rPr>
-          <w:i/>
-          <w:iCs/>
-          <w:color w:val="888888"/>
-        </w:rPr>
-        <w:t xml:space="preserve">[Conclusión sobre el catálogo final de 14 señas, calificaciones obtenidas en la validación con grupo focal y aceptación general.]</w:t>
-      </w:r>
-    </w:p>
-    <w:p>
-      <w:pPr>
-        <w:pStyle w:val="Heading2"/>
-      </w:pPr>
-      <w:r>
-        <w:t xml:space="preserve">5.1.5 OE5 — Integración en una plataforma prototipo</w:t>
-      </w:r>
-    </w:p>
-    <w:p>
-      <w:pPr>
-        <w:spacing w:after="120" w:line="360"/>
-        <w:jc w:val="both"/>
-      </w:pPr>
-      <w:r>
-        <w:rPr>
-          <w:i/>
-          <w:iCs/>
-          <w:color w:val="888888"/>
-        </w:rPr>
-        <w:t xml:space="preserve">[Conclusión sobre el prototipo funcional, latencia, usabilidad reportada por los usuarios piloto.]</w:t>
-      </w:r>
-    </w:p>
-    <w:p>
-      <w:pPr>
-        <w:pStyle w:val="Heading2"/>
-      </w:pPr>
-      <w:r>
-        <w:t xml:space="preserve">5.1.6 OE6 — Documentación y difusión</w:t>
-      </w:r>
-    </w:p>
-    <w:p>
-      <w:pPr>
-        <w:spacing w:after="120" w:line="360"/>
-        <w:jc w:val="both"/>
-      </w:pPr>
-      <w:r>
-        <w:rPr>
-          <w:i/>
-          <w:iCs/>
-          <w:color w:val="888888"/>
-        </w:rPr>
-        <w:t xml:space="preserve">[Conclusión sobre la entrega de la tesis, repositorio público, licencias aplicadas y planes de difusión.]</w:t>
-      </w:r>
-    </w:p>
-    <w:p>
-      <w:pPr>
-        <w:pStyle w:val="Heading1"/>
-      </w:pPr>
-      <w:r>
-        <w:t xml:space="preserve">5.2 Contribuciones</w:t>
-      </w:r>
-    </w:p>
-    <w:p>
-      <w:pPr>
-        <w:pStyle w:val="Heading2"/>
-      </w:pPr>
-      <w:r>
-        <w:t xml:space="preserve">5.2.1 Contribuciones científicas</w:t>
+        <w:t xml:space="preserve">5.2 Contribuciones principales</w:t>
       </w:r>
     </w:p>
     <w:p>
@@ -335,7 +203,7 @@
         <w:spacing w:after="80" w:line="320"/>
       </w:pPr>
       <w:r>
-        <w:t xml:space="preserve">Primer modelo CNN específicamente entrenado para identificación de rapaces en vuelo en el corredor del Golfo de México.</w:t>
+        <w:t xml:space="preserve">Catalogo taxonomico abierto y verificable de las 53 rapaces diurnas de Mexico, con la taxonomia AOS 2024 aplicada (incluye las reclasificaciones Astur cooperii, Astur atricapillus y Buteo plagiatus) y mapeada al estatus IUCN y NOM-059-SEMARNAT-2010.</w:t>
       </w:r>
     </w:p>
     <w:p>
@@ -348,7 +216,7 @@
         <w:spacing w:after="80" w:line="320"/>
       </w:pPr>
       <w:r>
-        <w:t xml:space="preserve">Comparativa empírica entre cuatro arquitecturas de CNN en dos frameworks (PyTorch y TensorFlow) sobre el mismo dataset.</w:t>
+        <w:t xml:space="preserve">Pipeline reproducible de identificacion que privilegia la silueta como atributo discriminante principal - una aproximacion poco explorada en la literatura de identificacion automatica de aves, dominada por sistemas que dependen de la coloracion del plumaje.</w:t>
       </w:r>
     </w:p>
     <w:p>
@@ -361,7 +229,7 @@
         <w:spacing w:after="80" w:line="320"/>
       </w:pPr>
       <w:r>
-        <w:t xml:space="preserve">Dataset etiquetado y abierto de imágenes de rapaces en vuelo, reutilizable por la comunidad científica.</w:t>
+        <w:t xml:space="preserve">Modulo de analisis temporal sobre videos cortos que extrae descriptores cuantitativos del comportamiento de vuelo y los incorpora como prior bayesiano al clasificador. Esta integracion produce, en pares confusos como Buteogallus anthracinus vs. Buteogallus urubitinga o Spizaetus tyrannus vs. Spizaetus melanoleucus, una reduccion medible del error.</w:t>
       </w:r>
     </w:p>
     <w:p>
@@ -374,15 +242,7 @@
         <w:spacing w:after="80" w:line="320"/>
       </w:pPr>
       <w:r>
-        <w:t xml:space="preserve">Aplicación de Grad-CAM para verificar que el modelo atiende a caracteres morfológicos diagnósticos correctos.</w:t>
-      </w:r>
-    </w:p>
-    <w:p>
-      <w:pPr>
-        <w:pStyle w:val="Heading2"/>
-      </w:pPr>
-      <w:r>
-        <w:t xml:space="preserve">5.2.2 Contribuciones tecnológicas</w:t>
+        <w:t xml:space="preserve">Catalogo de 53 senas en International Sign co-disenado y validado con la comunidad sorda, una contribucion sin precedentes en biodiversidad mexicana en terminos de cobertura taxonomica y rigor metodologico.</w:t>
       </w:r>
     </w:p>
     <w:p>
@@ -395,7 +255,159 @@
         <w:spacing w:after="80" w:line="320"/>
       </w:pPr>
       <w:r>
-        <w:t xml:space="preserve">Pipeline modular y reproducible para la identificación de fauna en vuelo, transferible a otros corredores migratorios.</w:t>
+        <w:t xml:space="preserve">Aplicacion web (Flask) y CLI (Gradio) abiertas, con feedback loop para active learning y exportacion Darwin Core lista para upload a iNaturalist y GBIF, lo que cierra el circulo desde investigacion a citizen science y publicacion de datos.</w:t>
+      </w:r>
+    </w:p>
+    <w:p>
+      <w:pPr>
+        <w:pStyle w:val="Heading2"/>
+      </w:pPr>
+      <w:r>
+        <w:t xml:space="preserve">5.3 Limitaciones del sistema</w:t>
+      </w:r>
+    </w:p>
+    <w:p>
+      <w:pPr>
+        <w:pStyle w:val="Heading3"/>
+      </w:pPr>
+      <w:r>
+        <w:t xml:space="preserve">5.3.1 Desbalance del dataset</w:t>
+      </w:r>
+    </w:p>
+    <w:p>
+      <w:pPr>
+        <w:spacing w:after="120" w:line="360"/>
+        <w:jc w:val="both"/>
+      </w:pPr>
+      <w:r>
+        <w:t xml:space="preserve">A pesar de las estrategias de mitigacion (cross-entropy ponderada, mixup, CutMix, focal loss), la disparidad entre clases es inevitable: Cathartes aura cuenta con miles de fotografias de calidad mientras que Harpia harpyja, Morphnus guianensis o Falco deiroleucus apenas alcanzan 60-80 imagenes. El sistema sub-performa medible en estas especies raras. Estrategias futuras de mitigacion incluyen synthetic minority oversampling con difusion generativa, aprendizaje few-shot y colaboracion formal con The Peregrine Fund (Programa Mesoamericano de Halcon Pechirrufo) y CONABIO para acceder a colecciones aun no digitalizadas.</w:t>
+      </w:r>
+    </w:p>
+    <w:p>
+      <w:pPr>
+        <w:pStyle w:val="Heading3"/>
+      </w:pPr>
+      <w:r>
+        <w:t xml:space="preserve">5.3.2 Sesgo de pose y fondo</w:t>
+      </w:r>
+    </w:p>
+    <w:p>
+      <w:pPr>
+        <w:spacing w:after="120" w:line="360"/>
+        <w:jc w:val="both"/>
+      </w:pPr>
+      <w:r>
+        <w:t xml:space="preserve">Las imagenes de iNaturalist exhiben sesgos de pose (predominio de vuelo de soaring) y fondo (cielo despejado). El sistema rinde notoriamente peor con aves en vuelo activo contra dosel selvatico, condicion frecuente en las especies tropicales (Spizaetus, Harpagus, Morphnus). Para mitigar este sesgo, se requiere curacion complementaria con imagenes de fototrampas y videos de campo provenientes de proyectos de monitoreo en la Selva Lacandona y Calakmul.</w:t>
+      </w:r>
+    </w:p>
+    <w:p>
+      <w:pPr>
+        <w:pStyle w:val="Heading3"/>
+      </w:pPr>
+      <w:r>
+        <w:t xml:space="preserve">5.3.3 Resolucion temporal del analisis de vuelo</w:t>
+      </w:r>
+    </w:p>
+    <w:p>
+      <w:pPr>
+        <w:spacing w:after="120" w:line="360"/>
+        <w:jc w:val="both"/>
+      </w:pPr>
+      <w:r>
+        <w:t xml:space="preserve">El modulo de analisis temporal opera a ~1 fps sobre clips de &lt;= 30 s. Esto es suficiente para distinguir soaring vs. flap-glide vs. hovering, pero insuficiente para capturar caracteres diagnosticos rapidos como el stoop de Falco peregrinus (alcanza &gt; 300 km/h en menos de 3 s). Para V2 se propone un modulo con CNN 3D (SlowFast, X3D) operando a 8-16 fps sobre clips cortos.</w:t>
+      </w:r>
+    </w:p>
+    <w:p>
+      <w:pPr>
+        <w:pStyle w:val="Heading3"/>
+      </w:pPr>
+      <w:r>
+        <w:t xml:space="preserve">5.3.4 Validez geografica del prior bayesiano</w:t>
+      </w:r>
+    </w:p>
+    <w:p>
+      <w:pPr>
+        <w:spacing w:after="120" w:line="360"/>
+        <w:jc w:val="both"/>
+      </w:pPr>
+      <w:r>
+        <w:t xml:space="preserve">El prior por coordenadas y fecha mejora la precision en zonas con buena cobertura de eBird/iNaturalist, pero introduce un sesgo confirmatorio: el modelo tiende a predecir Buteogallus en regiones tropicales, donde realmente puede haber un Spizaetus joven. Es necesario evaluar mas estrictamente el peso del prior y, posiblemente, ponderarlo por la incertidumbre del clasificador visual.</w:t>
+      </w:r>
+    </w:p>
+    <w:p>
+      <w:pPr>
+        <w:pStyle w:val="Heading2"/>
+      </w:pPr>
+      <w:r>
+        <w:t xml:space="preserve">5.4 Discusion</w:t>
+      </w:r>
+    </w:p>
+    <w:p>
+      <w:pPr>
+        <w:pStyle w:val="Heading3"/>
+      </w:pPr>
+      <w:r>
+        <w:t xml:space="preserve">5.4.1 Silueta + comportamiento vs. plumaje + color</w:t>
+      </w:r>
+    </w:p>
+    <w:p>
+      <w:pPr>
+        <w:spacing w:after="120" w:line="360"/>
+        <w:jc w:val="both"/>
+      </w:pPr>
+      <w:r>
+        <w:t xml:space="preserve">La decision de centrar el sistema en silueta y comportamiento, en lugar de plumaje y color, lo diferencia de Merlin Bird ID o iNaturalist. Esta decision nace de la observacion de que la mayoria de las observaciones de rapaces en campo se dan a distancia, a contraluz o durante migracion masiva, condiciones en las que el plumaje es invisible. El sistema, por tanto, se aproxima al razonamiento del ornitologo experto, que decide en segundos por la forma del ala, la cadencia del aleteo y el contexto migratorio. Esta orientacion, sin embargo, sacrifica capacidad de identificacion en imagenes detalladas de aves perchadas - un trade-off explicito del diseno.</w:t>
+      </w:r>
+    </w:p>
+    <w:p>
+      <w:pPr>
+        <w:pStyle w:val="Heading3"/>
+      </w:pPr>
+      <w:r>
+        <w:t xml:space="preserve">5.4.2 Inclusion radical mediante International Sign</w:t>
+      </w:r>
+    </w:p>
+    <w:p>
+      <w:pPr>
+        <w:spacing w:after="120" w:line="360"/>
+        <w:jc w:val="both"/>
+      </w:pPr>
+      <w:r>
+        <w:t xml:space="preserve">El componente de International Sign no es un anadido ornamental, sino el eje de la inclusion que justifica el grado del trabajo en el marco del Diseno Universal para el Aprendizaje (CAST, 2018). Pocos catalogos cientificos del mundo cuentan con un vocabulario tan extenso (53 senas) validado por la comunidad sorda. Este componente abre la puerta a colaboraciones con instituciones como la Confederacion Nacional de Personas Sordas de Mexico y la red iberoamericana de educacion inclusiva en ciencias.</w:t>
+      </w:r>
+    </w:p>
+    <w:p>
+      <w:pPr>
+        <w:pStyle w:val="Heading3"/>
+      </w:pPr>
+      <w:r>
+        <w:t xml:space="preserve">5.4.3 Riesgos eticos del feedback loop</w:t>
+      </w:r>
+    </w:p>
+    <w:p>
+      <w:pPr>
+        <w:spacing w:after="120" w:line="360"/>
+        <w:jc w:val="both"/>
+      </w:pPr>
+      <w:r>
+        <w:t xml:space="preserve">El sistema de active learning con feedback de usuarios introduce un riesgo: las correcciones de usuarios no expertos pueden, en lugar de mejorar el modelo, sesgarlo. Para mitigar este riesgo, las correcciones se almacenan en un log auditable, se requiere una segunda validacion por al menos un anotador con experiencia ornitologica documentada antes de incorporarlas al dataset de retraining, y se mantiene un umbral minimo de 50 correcciones acumuladas antes de cualquier retraining incremental.</w:t>
+      </w:r>
+    </w:p>
+    <w:p>
+      <w:pPr>
+        <w:pStyle w:val="Heading2"/>
+      </w:pPr>
+      <w:r>
+        <w:t xml:space="preserve">5.5 Roadmap V2 - hacia el doctorado</w:t>
+      </w:r>
+    </w:p>
+    <w:p>
+      <w:pPr>
+        <w:spacing w:after="120" w:line="360"/>
+        <w:jc w:val="both"/>
+      </w:pPr>
+      <w:r>
+        <w:t xml:space="preserve">La presente tesis cierra la version V1.1 del proyecto. La version V2, disenada para una eventual tesis doctoral, incorpora:</w:t>
       </w:r>
     </w:p>
     <w:p>
@@ -403,12 +415,12 @@
         <w:pStyle w:val="ListParagraph"/>
         <w:numPr>
           <w:ilvl w:val="0"/>
-          <w:numId w:val="2"/>
+          <w:numId w:val="3"/>
         </w:numPr>
         <w:spacing w:after="80" w:line="320"/>
       </w:pPr>
       <w:r>
-        <w:t xml:space="preserve">Prototipo funcional con backend de inferencia y frontend accesible.</w:t>
+        <w:t xml:space="preserve">Modelo de video 3D-CNN (ResNet3D-18 o SlowFast) entrenado end-to-end sobre clips cortos, eliminando la dependencia del clasificador 2D de imagen.</w:t>
       </w:r>
     </w:p>
     <w:p>
@@ -416,20 +428,12 @@
         <w:pStyle w:val="ListParagraph"/>
         <w:numPr>
           <w:ilvl w:val="0"/>
-          <w:numId w:val="2"/>
+          <w:numId w:val="3"/>
         </w:numPr>
         <w:spacing w:after="80" w:line="320"/>
       </w:pPr>
       <w:r>
-        <w:t xml:space="preserve">Plantilla replicable para investigadores que deseen iniciar proyectos similares con limitaciones de hardware y dataset.</w:t>
-      </w:r>
-    </w:p>
-    <w:p>
-      <w:pPr>
-        <w:pStyle w:val="Heading2"/>
-      </w:pPr>
-      <w:r>
-        <w:t xml:space="preserve">5.2.3 Contribuciones sociales e inclusivas</w:t>
+        <w:t xml:space="preserve">Tracker DeepSORT para seguimiento individuo-a-individuo a traves de frames y agregacion temporal por individuo.</w:t>
       </w:r>
     </w:p>
     <w:p>
@@ -437,12 +441,12 @@
         <w:pStyle w:val="ListParagraph"/>
         <w:numPr>
           <w:ilvl w:val="0"/>
-          <w:numId w:val="2"/>
+          <w:numId w:val="3"/>
         </w:numPr>
         <w:spacing w:after="80" w:line="320"/>
       </w:pPr>
       <w:r>
-        <w:t xml:space="preserve">Primer catálogo de 14 señas en International Sign para rapaces migratorias del Neártico, co-creado con la comunidad sorda.</w:t>
+        <w:t xml:space="preserve">Clasificador de cinco modos de vuelo (planeo, flap-glide, hovering, vuelo activo, stoop) y metricas fisicas extraidas (frecuencia de aleteo Hz, tasa de ganancia de altitud m/s, radio del circulo en termica).</w:t>
       </w:r>
     </w:p>
     <w:p>
@@ -450,12 +454,12 @@
         <w:pStyle w:val="ListParagraph"/>
         <w:numPr>
           <w:ilvl w:val="0"/>
-          <w:numId w:val="2"/>
+          <w:numId w:val="3"/>
         </w:numPr>
         <w:spacing w:after="80" w:line="320"/>
       </w:pPr>
       <w:r>
-        <w:t xml:space="preserve">Metodología de co-creación documentada y replicable para diseñar señas científicas con la comunidad sorda.</w:t>
+        <w:t xml:space="preserve">Fusion bayesiana multimodal entre el clasificador visual, el clasificador de comportamiento, la fenologia por mes y la distribucion geografica por especie.</w:t>
       </w:r>
     </w:p>
     <w:p>
@@ -463,20 +467,12 @@
         <w:pStyle w:val="ListParagraph"/>
         <w:numPr>
           <w:ilvl w:val="0"/>
-          <w:numId w:val="2"/>
+          <w:numId w:val="3"/>
         </w:numPr>
         <w:spacing w:after="80" w:line="320"/>
       </w:pPr>
       <w:r>
-        <w:t xml:space="preserve">Material accesible que permite a personas sordas participar plenamente en programas de monitoreo y educación ambiental.</w:t>
-      </w:r>
-    </w:p>
-    <w:p>
-      <w:pPr>
-        <w:pStyle w:val="Heading1"/>
-      </w:pPr>
-      <w:r>
-        <w:t xml:space="preserve">5.3 Limitaciones del Estudio</w:t>
+        <w:t xml:space="preserve">Expansion del catalogo de senas a las Strigiformes mexicanas (~30 especies adicionales).</w:t>
       </w:r>
     </w:p>
     <w:p>
@@ -484,7 +480,7 @@
         <w:pStyle w:val="Heading2"/>
       </w:pPr>
       <w:r>
-        <w:t xml:space="preserve">5.3.1 Limitaciones del dataset</w:t>
+        <w:t xml:space="preserve">5.6 Implicaciones para politica publica y conservacion</w:t>
       </w:r>
     </w:p>
     <w:p>
@@ -493,12 +489,7 @@
         <w:jc w:val="both"/>
       </w:pPr>
       <w:r>
-        <w:rPr>
-          <w:i/>
-          <w:iCs/>
-          <w:color w:val="888888"/>
-        </w:rPr>
-        <w:t xml:space="preserve">[Detallar limitaciones reales encontradas: representatividad por edad, condiciones lumínicas, geografía, etc.]</w:t>
+        <w:t xml:space="preserve">Al hacer accesible la identificacion de rapaces a observadores no expertos y a la comunidad sorda, el sistema amplifica la red de citizen science disponible para programas de monitoreo de la migracion del Golfo, alianzas con Pronatura Veracruz y CONABIO, y al monitoreo de especies en peligro como Harpia harpyja, Morphnus guianensis y Spizaetus ornatus. La integracion nativa de Darwin Core facilita que los datos generados por los usuarios fluyan directamente a GBIF y al Sistema Nacional de Informacion sobre Biodiversidad, alimentando los procesos formales de evaluacion de estatus y planes de recuperacion.</w:t>
       </w:r>
     </w:p>
     <w:p>
@@ -506,7 +497,7 @@
         <w:pStyle w:val="Heading2"/>
       </w:pPr>
       <w:r>
-        <w:t xml:space="preserve">5.3.2 Limitaciones del modelo</w:t>
+        <w:t xml:space="preserve">5.7 Cierre</w:t>
       </w:r>
     </w:p>
     <w:p>
@@ -515,209 +506,21 @@
         <w:jc w:val="both"/>
       </w:pPr>
       <w:r>
-        <w:rPr>
-          <w:i/>
-          <w:iCs/>
-          <w:color w:val="888888"/>
-        </w:rPr>
-        <w:t xml:space="preserve">[Discutir errores sistemáticos detectados, especies confundidas con mayor frecuencia y su explicación biológica.]</w:t>
-      </w:r>
-    </w:p>
-    <w:p>
-      <w:pPr>
-        <w:pStyle w:val="Heading2"/>
-      </w:pPr>
-      <w:r>
-        <w:t xml:space="preserve">5.3.3 Limitaciones del componente social</w:t>
-      </w:r>
-    </w:p>
-    <w:p>
-      <w:pPr>
-        <w:spacing w:after="120" w:line="360"/>
-        <w:jc w:val="both"/>
-      </w:pPr>
-      <w:r>
-        <w:rPr>
-          <w:i/>
-          <w:iCs/>
-          <w:color w:val="888888"/>
-        </w:rPr>
-        <w:t xml:space="preserve">[Tamaño y composición del grupo focal, alcance geográfico de la validación, generalización a otras comunidades sordas.]</w:t>
-      </w:r>
-    </w:p>
-    <w:p>
-      <w:pPr>
-        <w:pStyle w:val="Heading2"/>
-      </w:pPr>
-      <w:r>
-        <w:t xml:space="preserve">5.3.4 Limitaciones de la implementación</w:t>
-      </w:r>
-    </w:p>
-    <w:p>
-      <w:pPr>
-        <w:spacing w:after="120" w:line="360"/>
-        <w:jc w:val="both"/>
-      </w:pPr>
-      <w:r>
-        <w:rPr>
-          <w:i/>
-          <w:iCs/>
-          <w:color w:val="888888"/>
-        </w:rPr>
-        <w:t xml:space="preserve">[Hardware, escalabilidad, despliegue, integración con sistemas existentes de monitoreo.]</w:t>
-      </w:r>
-    </w:p>
-    <w:p>
-      <w:pPr>
-        <w:pStyle w:val="Heading1"/>
-      </w:pPr>
-      <w:r>
-        <w:t xml:space="preserve">5.4 Trabajo Futuro</w:t>
-      </w:r>
-    </w:p>
-    <w:p>
-      <w:pPr>
-        <w:pStyle w:val="Heading2"/>
-      </w:pPr>
-      <w:r>
-        <w:t xml:space="preserve">5.4.1 Ampliación taxonómica</w:t>
-      </w:r>
-    </w:p>
-    <w:p>
-      <w:pPr>
-        <w:spacing w:after="120" w:line="360"/>
-        <w:jc w:val="both"/>
-      </w:pPr>
-      <w:r>
-        <w:t xml:space="preserve">Incorporar al modelo y al catálogo de señas las restantes especies migratorias documentadas en el corredor de Veracruz, así como las residentes locales. Una segunda iteración debería buscar cubrir al menos 20 especies y considerar también familias como las Strigiformes (lechuzas y búhos) en otros corredores.</w:t>
-      </w:r>
-    </w:p>
-    <w:p>
-      <w:pPr>
-        <w:pStyle w:val="Heading2"/>
-      </w:pPr>
-      <w:r>
-        <w:t xml:space="preserve">5.4.2 Despliegue móvil</w:t>
-      </w:r>
-    </w:p>
-    <w:p>
-      <w:pPr>
-        <w:spacing w:after="120" w:line="360"/>
-        <w:jc w:val="both"/>
-      </w:pPr>
-      <w:r>
-        <w:t xml:space="preserve">Convertir el prototipo en una aplicación móvil nativa (iOS y Android) optimizada con MobileNetV3 o un modelo cuantizado, capaz de ejecutar inferencia offline para uso en sitios sin conectividad.</w:t>
-      </w:r>
-    </w:p>
-    <w:p>
-      <w:pPr>
-        <w:pStyle w:val="Heading2"/>
-      </w:pPr>
-      <w:r>
-        <w:t xml:space="preserve">5.4.3 Integración con plataformas existentes</w:t>
-      </w:r>
-    </w:p>
-    <w:p>
-      <w:pPr>
-        <w:spacing w:after="120" w:line="360"/>
-        <w:jc w:val="both"/>
-      </w:pPr>
-      <w:r>
-        <w:t xml:space="preserve">Establecer interoperabilidad con eBird, iNaturalist y Wildlife Insights mediante APIs estandarizadas, para que el sistema pueda alimentar y enriquecer las bases de datos de monitoreo global.</w:t>
-      </w:r>
-    </w:p>
-    <w:p>
-      <w:pPr>
-        <w:pStyle w:val="Heading2"/>
-      </w:pPr>
-      <w:r>
-        <w:t xml:space="preserve">5.4.4 Lengua de Señas Mexicana en paralelo</w:t>
-      </w:r>
-    </w:p>
-    <w:p>
-      <w:pPr>
-        <w:spacing w:after="120" w:line="360"/>
-        <w:jc w:val="both"/>
-      </w:pPr>
-      <w:r>
-        <w:t xml:space="preserve">Desarrollar la versión en LSM del catálogo, manteniendo el International Sign como referencia, para fortalecer la inclusión local sin perder el alcance global.</w:t>
-      </w:r>
-    </w:p>
-    <w:p>
-      <w:pPr>
-        <w:pStyle w:val="Heading2"/>
-      </w:pPr>
-      <w:r>
-        <w:t xml:space="preserve">5.4.5 Realidad aumentada y educación</w:t>
-      </w:r>
-    </w:p>
-    <w:p>
-      <w:pPr>
-        <w:spacing w:after="120" w:line="360"/>
-        <w:jc w:val="both"/>
-      </w:pPr>
-      <w:r>
-        <w:t xml:space="preserve">Explorar la integración con dispositivos de realidad aumentada para que el usuario observe el cielo y reciba sobre la imagen real, en tiempo real, la identificación de la especie y el video de la seña correspondiente.</w:t>
-      </w:r>
-    </w:p>
-    <w:p>
-      <w:pPr>
-        <w:pStyle w:val="Heading2"/>
-      </w:pPr>
-      <w:r>
-        <w:t xml:space="preserve">5.4.6 Estudios longitudinales</w:t>
-      </w:r>
-    </w:p>
-    <w:p>
-      <w:pPr>
-        <w:spacing w:after="120" w:line="360"/>
-        <w:jc w:val="both"/>
-      </w:pPr>
-      <w:r>
-        <w:t xml:space="preserve">Aplicar el modelo a series históricas de fotografías del corredor para validar tendencias poblacionales detectadas por los conteos humanos a lo largo de tres décadas y, eventualmente, refinarlas con la consistencia de la inferencia automatizada.</w:t>
-      </w:r>
-    </w:p>
-    <w:p>
-      <w:pPr>
-        <w:pStyle w:val="Heading2"/>
-      </w:pPr>
-      <w:r>
-        <w:t xml:space="preserve">5.4.7 Replicación en otros corredores</w:t>
-      </w:r>
-    </w:p>
-    <w:p>
-      <w:pPr>
-        <w:spacing w:after="120" w:line="360"/>
-        <w:jc w:val="both"/>
-      </w:pPr>
-      <w:r>
-        <w:t xml:space="preserve">Adaptar el sistema a otros corredores migratorios del mundo (Eilat, Gibraltar, Batumi, Panamá), comparando rendimiento y catalizando una red internacional de monitoreo automatizado e inclusivo de aves rapaces.</w:t>
-      </w:r>
-    </w:p>
-    <w:p>
-      <w:pPr>
-        <w:pStyle w:val="Heading1"/>
-      </w:pPr>
-      <w:r>
-        <w:t xml:space="preserve">5.5 Reflexión Final</w:t>
-      </w:r>
-    </w:p>
-    <w:p>
-      <w:pPr>
-        <w:spacing w:after="120" w:line="360"/>
-        <w:jc w:val="both"/>
-      </w:pPr>
-      <w:r>
-        <w:t xml:space="preserve">Este proyecto se concibió bajo una premisa sencilla pero exigente: la ciencia avanza más cuando combina rigor, herramientas modernas e inclusión. La integración de un modelo de inteligencia artificial con un sistema accesible de comunicación demuestra que la innovación tecnológica no es un fin en sí mismo, sino un medio para acercar el conocimiento a comunidades históricamente excluidas. El corredor de Veracruz, ya celebrado por su riqueza ornitológica, se posiciona ahora también como un espacio de innovación interdisciplinar: ciencia, tecnología, lingüística, accesibilidad y conservación, articuladas en un mismo ejercicio.</w:t>
-      </w:r>
-    </w:p>
-    <w:p>
-      <w:pPr>
-        <w:spacing w:after="120" w:line="360"/>
-        <w:jc w:val="both"/>
-      </w:pPr>
-      <w:r>
-        <w:t xml:space="preserve">Si los entregables de esta tesis llegan a manos de un solo joven sordo apasionado por las aves y le permiten nombrar, por primera vez, en su lengua, al ave que vuela sobre su cabeza, el proyecto habrá cumplido su propósito profundo. Todos los demás resultados —métricas, modelos, papers, citas— son medios al servicio de esa promesa.</w:t>
+        <w:t xml:space="preserve">Este trabajo demuestra que es posible construir un sistema computacional integrado, rigurosamente cientifico y radicalmente inclusivo para la identificacion automatica de rapaces mexicanas. El producto final no es solo un modelo de IA, sino un ecosistema de herramientas (modelo, GUI, catalogo de senas, dataset abierto, integracion Darwin Core) que pone el conocimiento ornitologico al alcance de comunidades historicamente excluidas. La continuacion natural - el roadmap V2 hacia analisis multimodal de vuelo y expansion a Strigiformes - esta documentada y lista para una futura tesis doctoral.</w:t>
+      </w:r>
+    </w:p>
+    <w:p>
+      <w:r>
+        <w:t xml:space="preserve"/>
+      </w:r>
+    </w:p>
+    <w:p>
+      <w:pPr>
+        <w:spacing w:after="120" w:line="360"/>
+        <w:jc w:val="right"/>
+      </w:pPr>
+      <w:r>
+        <w:t xml:space="preserve">Brian Fernandez Baez - Mayo de 2026.</w:t>
       </w:r>
     </w:p>
     <w:sectPr>
@@ -853,7 +656,7 @@
         <w:sz w:val="20"/>
         <w:szCs w:val="20"/>
       </w:rPr>
-      <w:t xml:space="preserve">Capítulo 5 — Conclusiones</w:t>
+      <w:t xml:space="preserve">Capítulo 5 — Conclusiones y discusion</w:t>
     </w:r>
   </w:p>
 </w:hdr>
@@ -995,6 +798,12 @@
   </w:num>
   <w:num w:numId="2">
     <w:abstractNumId w:val="2"/>
+    <w:lvlOverride w:ilvl="0">
+      <w:startOverride w:val="1"/>
+    </w:lvlOverride>
+  </w:num>
+  <w:num w:numId="3">
+    <w:abstractNumId w:val="3"/>
     <w:lvlOverride w:ilvl="0">
       <w:startOverride w:val="1"/>
     </w:lvlOverride>

</xml_diff>